<commit_message>
Reto, kit e induccion: lo del 4 de noviembre queda abierto (se habla con el resultado en la mano), sin tramos de contrato
Co-Authored-By: Claude Fable 5.1 <noreply@anthropic.com>
</commit_message>
<xml_diff>
--- a/recursos/comercial/INDUCCION_COMERCIAL/contratacion comercial/HOJA_INDUCCION_RETO_ALIANZAS.docx
+++ b/recursos/comercial/INDUCCION_COMERCIAL/contratacion comercial/HOJA_INDUCCION_RETO_ALIANZAS.docx
@@ -221,7 +221,7 @@
                 <w:b w:val="0"/>
                 <w:sz w:val="17"/>
               </w:rPr>
-              <w:t>Él te dice la meta, la fecha, qué cuenta como inscrito pagado, qué recibe y qué pasa el 4 de noviembre. Si se equivoca en algo, se corrige ahí. 2 minutos para que te diga qué dudas le dejó la lectura.</w:t>
+              <w:t>Él te dice la meta, la fecha, qué cuenta como inscrito pagado, qué recibe, y que el 4 de noviembre se habla con el resultado en la mano. Si se equivoca en algo, se corrige ahí. 2 minutos para que te diga qué dudas le dejó la lectura.</w:t>
             </w:r>
           </w:p>
         </w:tc>
@@ -731,7 +731,7 @@
           <w:b w:val="0"/>
           <w:sz w:val="18"/>
         </w:rPr>
-        <w:t>No se le muestra el esquema ni el nombre de ningún otro ejecutivo. No se le dan precios ni condiciones que no estén en el kit. No se le promete el contrato del 4 de noviembre: se le repite que depende del resultado. No se alarga: a las 10:00 sale, aunque falte algo; lo que falte se resuelve a las 8:30 del martes.</w:t>
+        <w:t>No se le muestra el esquema ni el nombre de ningún otro ejecutivo. No se le dan precios ni condiciones que no estén en el kit. No se le promete ningún contrato: el 4 de noviembre se habla con el resultado en la mano. No se alarga: a las 10:00 sale, aunque falte algo; lo que falte se resuelve a las 8:30 del martes.</w:t>
       </w:r>
     </w:p>
     <w:tbl>

</xml_diff>

<commit_message>
Reto de arranque para el candidato 3 (arranque miercoles 21/10, 9 dias habiles); kit, Excel y hoja de induccion con fechas del miercoles 21
Co-Authored-By: Claude Fable 5.1 <noreply@anthropic.com>
</commit_message>
<xml_diff>
--- a/recursos/comercial/INDUCCION_COMERCIAL/contratacion comercial/HOJA_INDUCCION_RETO_ALIANZAS.docx
+++ b/recursos/comercial/INDUCCION_COMERCIAL/contratacion comercial/HOJA_INDUCCION_RETO_ALIANZAS.docx
@@ -26,7 +26,7 @@
           <w:color w:val="666666"/>
           <w:sz w:val="17"/>
         </w:rPr>
-        <w:t>Lunes 19 de octubre de 2026 · 8:00 a 10:00 a. m. · Sede · Hoja de gerencia · Él habla más que tú: en cada bloque él explica y tú corriges</w:t>
+        <w:t>Miércoles 21 de octubre de 2026 · 8:00 a 10:00 a. m. · Sede · Hoja de gerencia · Él habla más que tú: en cada bloque él explica y tú corriges</w:t>
       </w:r>
     </w:p>
     <w:p>
@@ -486,7 +486,7 @@
                 <w:b w:val="0"/>
                 <w:sz w:val="17"/>
               </w:rPr>
-              <w:t>Abre el Excel y mete ahí, en vivo, las empresas que trae con nombre y cargo del decisor. Regla: toda empresa registrada antes de la primera reunión. Le muestras el reporte diario de 3 líneas y la hoja INTERESADOS. Meta del martes: 15 empresas.</w:t>
+              <w:t>Abre el Excel y mete ahí, en vivo, las empresas que trae con nombre y cargo del decisor. Regla: toda empresa registrada antes de la primera reunión. Le muestras el reporte diario de 3 líneas y la hoja INTERESADOS. Meta del jueves: 15 empresas.</w:t>
             </w:r>
           </w:p>
         </w:tc>
@@ -698,7 +698,7 @@
                 <w:b w:val="0"/>
                 <w:sz w:val="17"/>
               </w:rPr>
-              <w:t>Todos los días 8:30, 15 minutos por llamada: rutina, dudas, sugerencias, recomendaciones, indicadores si hay. Cortes: martes 20 (15 empresas), viernes 23 (8 reuniones, 3 charlas), martes 3/11 6:00 p. m. Un solo canal de WhatsApp contigo. A las 10:00, a la calle.</w:t>
+              <w:t>Todos los días 8:30, 15 minutos por llamada: rutina, dudas, sugerencias, recomendaciones, indicadores si hay. Cortes: jueves 22 (15 empresas), martes 27 (8 reuniones, 3 charlas), martes 3/11 6:00 p. m. Un solo canal de WhatsApp contigo. A las 10:00, a la calle.</w:t>
             </w:r>
           </w:p>
         </w:tc>
@@ -731,7 +731,7 @@
           <w:b w:val="0"/>
           <w:sz w:val="18"/>
         </w:rPr>
-        <w:t>No se le muestra el esquema ni el nombre de ningún otro ejecutivo. No se le dan precios ni condiciones que no estén en el kit. No se le promete ningún contrato: el 4 de noviembre se habla con el resultado en la mano. No se alarga: a las 10:00 sale, aunque falte algo; lo que falte se resuelve a las 8:30 del martes.</w:t>
+        <w:t>No se le muestra el esquema ni el nombre de ningún otro ejecutivo. No se le dan precios ni condiciones que no estén en el kit. No se le promete ningún contrato: el 4 de noviembre se habla con el resultado en la mano. No se alarga: a las 10:00 sale, aunque falte algo; lo que falte se resuelve a las 8:30 del jueves.</w:t>
       </w:r>
     </w:p>
     <w:tbl>

</xml_diff>